<commit_message>
Correct MotionIPC boundary contracts and publish firmware FRD v5.3
</commit_message>
<xml_diff>
--- a/01-dual-core-firmware/docs/DualCore_Optical_Motion_Firmware_Host_FRD.docx
+++ b/01-dual-core-firmware/docs/DualCore_Optical_Motion_Firmware_Host_FRD.docx
@@ -86,7 +86,7 @@
               </w:rPr>
               <w:t>Customer-facing technical report</w:t>
               <w:br/>
-              <w:t>Revision 5.2 - 5 August 2026</w:t>
+              <w:t>Revision 5.3 - 6 August 2026</w:t>
             </w:r>
           </w:p>
           <w:p>
@@ -128,7 +128,7 @@
                 <w:color w:val="2F506F"/>
                 <w:sz w:val="17"/>
               </w:rPr>
-              <w:t>ENGINEERING REQUIREMENTS DOCUMENT  |  REVISION 5.2  |  5 AUGUST 2026</w:t>
+              <w:t>ENGINEERING REQUIREMENTS DOCUMENT  |  REVISION 5.3  |  6 AUGUST 2026</w:t>
             </w:r>
           </w:p>
         </w:tc>
@@ -4906,17 +4906,8 @@
             </w:tcBorders>
           </w:tcPr>
           <w:p>
-            <w:pPr>
-              <w:spacing w:before="0" w:after="0" w:line="240" w:lineRule="auto"/>
-            </w:pPr>
-            <w:r>
-              <w:rPr>
-                <w:rFonts w:ascii="Aptos" w:hAnsi="Aptos" w:eastAsia="Aptos"/>
-                <w:b w:val="0"/>
-                <w:color w:val="22272B"/>
-                <w:sz w:val="16"/>
-              </w:rPr>
-              <w:t>64-byte records; 4,096 nominal entries</w:t>
+            <w:r>
+              <w:t>64-byte records; 4,095 entries; 64-byte metadata; exact 256 KiB fit guarded at compile time</w:t>
             </w:r>
           </w:p>
         </w:tc>
@@ -5190,7 +5181,7 @@
         <w:jc w:val="center"/>
       </w:pPr>
       <w:r>
-        <w:t>Figure 3. MotionIPC shared-memory allocation and the engineering review finding on nominal ring capacity.</w:t>
+        <w:t>Figure 3. MotionIPC shared-memory allocation after the 4,095-record boundary correction and compile-time layout guard.</w:t>
       </w:r>
     </w:p>
     <w:p>
@@ -5198,7 +5189,7 @@
         <w:pStyle w:val="ListBullet"/>
       </w:pPr>
       <w:r>
-        <w:t>OpenAMP resources occupy D3 SRAM while the custom producer/consumer ring is allocated in AXI SRAM.</w:t>
+        <w:t>OpenAMP resources occupy D3 SRAM while the custom producer/consumer ring is allocated in AXI SRAM. The public layout now consumes the 256 KiB reservation exactly: one 64-byte metadata block plus 4,095 aligned 64-byte records.</w:t>
       </w:r>
     </w:p>
     <w:p>
@@ -5214,7 +5205,7 @@
         <w:pStyle w:val="ListBullet"/>
       </w:pPr>
       <w:r>
-        <w:t>Engineering review identified that 4,096 records plus metadata exceed a 256 KiB allocation by approximately one record; release should use 4,095 entries or enlarge the reserved region.</w:t>
+        <w:t>The corrected public ring definition uses 4,095 records. A 64-byte metadata block plus 4,095 aligned 64-byte samples equals exactly 256 KiB, and compile-time assertions reject any layout that exceeds the reserved AXI-SRAM region.</w:t>
       </w:r>
     </w:p>
     <w:p>
@@ -8517,122 +8508,73 @@
         <w:t>8.2 Drivetrain and Encoder Conversion</w:t>
       </w:r>
     </w:p>
+    <w:p>
+      <w:pPr/>
+      <w:r>
+        <w:t>8.3 Public Memory, Protocol, and Timebase Contracts</w:t>
+      </w:r>
+    </w:p>
+    <w:p>
+      <w:r>
+        <w:rPr>
+          <w:b/>
+          <w:sz w:val="18"/>
+        </w:rPr>
+        <w:t>Public contract definitions and verification evidence:</w:t>
+      </w:r>
+    </w:p>
     <w:tbl>
       <w:tblPr>
+        <w:tblStyle w:val="TableGrid"/>
         <w:tblW w:type="auto" w:w="0"/>
         <w:jc w:val="center"/>
-        <w:tblLayout w:type="autofit"/>
         <w:tblLook w:firstColumn="1" w:firstRow="1" w:lastColumn="0" w:lastRow="0" w:noHBand="0" w:noVBand="1" w:val="04A0"/>
       </w:tblPr>
       <w:tblGrid>
-        <w:gridCol w:w="3456"/>
-        <w:gridCol w:w="3456"/>
-        <w:gridCol w:w="3456"/>
+        <w:gridCol w:w="3427"/>
+        <w:gridCol w:w="3427"/>
+        <w:gridCol w:w="3427"/>
       </w:tblGrid>
       <w:tr>
-        <w:trPr>
-          <w:tblHeader/>
-          <w:tblHeader w:val="true"/>
-        </w:trPr>
-        <w:tc>
-          <w:tcPr>
-            <w:tcW w:type="dxa" w:w="2448"/>
-            <w:shd w:fill="20364F"/>
-            <w:tcMar>
-              <w:top w:w="65" w:type="dxa"/>
-              <w:start w:w="75" w:type="dxa"/>
-              <w:bottom w:w="65" w:type="dxa"/>
-              <w:end w:w="75" w:type="dxa"/>
-            </w:tcMar>
-            <w:vAlign w:val="center"/>
-            <w:tcBorders>
-              <w:top w:val="single" w:sz="3" w:color="AEB8C2"/>
-              <w:bottom w:val="single" w:sz="3" w:color="AEB8C2"/>
-              <w:start w:val="single" w:sz="3" w:color="AEB8C2"/>
-              <w:end w:val="single" w:sz="3" w:color="AEB8C2"/>
-            </w:tcBorders>
-          </w:tcPr>
-          <w:p>
-            <w:pPr>
-              <w:spacing w:after="0" w:line="240" w:lineRule="auto" w:before="0"/>
-              <w:jc w:val="center"/>
-            </w:pPr>
-            <w:r>
-              <w:rPr>
-                <w:rFonts w:ascii="Aptos" w:hAnsi="Aptos" w:eastAsia="Aptos"/>
-                <w:b/>
-                <w:color w:val="FFFFFF"/>
-                <w:sz w:val="16"/>
-              </w:rPr>
-              <w:t>Quantity</w:t>
-            </w:r>
-          </w:p>
-        </w:tc>
-        <w:tc>
-          <w:tcPr>
-            <w:tcW w:type="dxa" w:w="3024"/>
-            <w:shd w:fill="20364F"/>
-            <w:tcMar>
-              <w:top w:w="65" w:type="dxa"/>
-              <w:start w:w="75" w:type="dxa"/>
-              <w:bottom w:w="65" w:type="dxa"/>
-              <w:end w:w="75" w:type="dxa"/>
-            </w:tcMar>
-            <w:vAlign w:val="center"/>
-            <w:tcBorders>
-              <w:top w:val="single" w:sz="3" w:color="AEB8C2"/>
-              <w:bottom w:val="single" w:sz="3" w:color="AEB8C2"/>
-              <w:start w:val="single" w:sz="3" w:color="AEB8C2"/>
-              <w:end w:val="single" w:sz="3" w:color="AEB8C2"/>
-            </w:tcBorders>
-          </w:tcPr>
-          <w:p>
-            <w:pPr>
-              <w:spacing w:after="0" w:line="240" w:lineRule="auto" w:before="0"/>
-              <w:jc w:val="center"/>
-            </w:pPr>
-            <w:r>
-              <w:rPr>
-                <w:rFonts w:ascii="Aptos" w:hAnsi="Aptos" w:eastAsia="Aptos"/>
-                <w:b/>
-                <w:color w:val="FFFFFF"/>
-                <w:sz w:val="16"/>
-              </w:rPr>
-              <w:t>Calculation / value</w:t>
-            </w:r>
-          </w:p>
-        </w:tc>
-        <w:tc>
-          <w:tcPr>
-            <w:tcW w:type="dxa" w:w="4608"/>
-            <w:shd w:fill="20364F"/>
-            <w:tcMar>
-              <w:top w:w="65" w:type="dxa"/>
-              <w:start w:w="75" w:type="dxa"/>
-              <w:bottom w:w="65" w:type="dxa"/>
-              <w:end w:w="75" w:type="dxa"/>
-            </w:tcMar>
-            <w:vAlign w:val="center"/>
-            <w:tcBorders>
-              <w:top w:val="single" w:sz="3" w:color="AEB8C2"/>
-              <w:bottom w:val="single" w:sz="3" w:color="AEB8C2"/>
-              <w:start w:val="single" w:sz="3" w:color="AEB8C2"/>
-              <w:end w:val="single" w:sz="3" w:color="AEB8C2"/>
-            </w:tcBorders>
-          </w:tcPr>
-          <w:p>
-            <w:pPr>
-              <w:spacing w:after="0" w:line="240" w:lineRule="auto" w:before="0"/>
-              <w:jc w:val="center"/>
-            </w:pPr>
-            <w:r>
-              <w:rPr>
-                <w:rFonts w:ascii="Aptos" w:hAnsi="Aptos" w:eastAsia="Aptos"/>
-                <w:b/>
-                <w:color w:val="FFFFFF"/>
-                <w:sz w:val="16"/>
-              </w:rPr>
-              <w:t>Interpretation</w:t>
+        <w:tc>
+          <w:tcPr>
+            <w:tcW w:type="dxa" w:w="3427"/>
+            <w:vAlign w:val="center"/>
+          </w:tcPr>
+          <w:p>
+            <w:r>
+              <w:rPr>
+                <w:sz w:val="17"/>
+              </w:rPr>
+              <w:t>AXI-SRAM ring boundary</w:t>
+            </w:r>
+          </w:p>
+        </w:tc>
+        <w:tc>
+          <w:tcPr>
+            <w:tcW w:type="dxa" w:w="3427"/>
+            <w:vAlign w:val="center"/>
+          </w:tcPr>
+          <w:p>
+            <w:r>
+              <w:rPr>
+                <w:sz w:val="17"/>
+              </w:rPr>
+              <w:t>64-byte metadata + 4,095 x 64-byte samples = 262,144 bytes (256 KiB).</w:t>
+            </w:r>
+          </w:p>
+        </w:tc>
+        <w:tc>
+          <w:tcPr>
+            <w:tcW w:type="dxa" w:w="3427"/>
+            <w:vAlign w:val="center"/>
+          </w:tcPr>
+          <w:p>
+            <w:r>
+              <w:rPr>
+                <w:sz w:val="17"/>
+              </w:rPr>
+              <w:t>Static assertions check sample size, metadata offset, and total MotionSharedRing size.</w:t>
             </w:r>
           </w:p>
         </w:tc>
@@ -8640,100 +8582,43 @@
       <w:tr>
         <w:tc>
           <w:tcPr>
-            <w:tcW w:type="dxa" w:w="2448"/>
-            <w:shd w:fill="FFFFFF"/>
-            <w:tcMar>
-              <w:top w:w="65" w:type="dxa"/>
-              <w:start w:w="75" w:type="dxa"/>
-              <w:bottom w:w="65" w:type="dxa"/>
-              <w:end w:w="75" w:type="dxa"/>
-            </w:tcMar>
-            <w:vAlign w:val="center"/>
-            <w:tcBorders>
-              <w:top w:val="single" w:sz="3" w:color="AEB8C2"/>
-              <w:bottom w:val="single" w:sz="3" w:color="AEB8C2"/>
-              <w:start w:val="single" w:sz="3" w:color="AEB8C2"/>
-              <w:end w:val="single" w:sz="3" w:color="AEB8C2"/>
-            </w:tcBorders>
-          </w:tcPr>
-          <w:p>
-            <w:pPr>
-              <w:spacing w:after="0" w:line="240" w:lineRule="auto" w:before="0"/>
-            </w:pPr>
-            <w:r>
-              <w:rPr>
-                <w:rFonts w:ascii="Aptos" w:hAnsi="Aptos" w:eastAsia="Aptos"/>
-                <w:b/>
-                <w:color w:val="22272B"/>
-                <w:sz w:val="16"/>
-              </w:rPr>
-              <w:t>Motor steps</w:t>
-            </w:r>
-          </w:p>
-        </w:tc>
-        <w:tc>
-          <w:tcPr>
-            <w:tcW w:type="dxa" w:w="3024"/>
-            <w:shd w:fill="FFFFFF"/>
-            <w:tcMar>
-              <w:top w:w="65" w:type="dxa"/>
-              <w:start w:w="75" w:type="dxa"/>
-              <w:bottom w:w="65" w:type="dxa"/>
-              <w:end w:w="75" w:type="dxa"/>
-            </w:tcMar>
-            <w:vAlign w:val="center"/>
-            <w:tcBorders>
-              <w:top w:val="single" w:sz="3" w:color="AEB8C2"/>
-              <w:bottom w:val="single" w:sz="3" w:color="AEB8C2"/>
-              <w:start w:val="single" w:sz="3" w:color="AEB8C2"/>
-              <w:end w:val="single" w:sz="3" w:color="AEB8C2"/>
-            </w:tcBorders>
-          </w:tcPr>
-          <w:p>
-            <w:pPr>
-              <w:spacing w:after="0" w:line="240" w:lineRule="auto" w:before="0"/>
-            </w:pPr>
-            <w:r>
-              <w:rPr>
-                <w:rFonts w:ascii="Aptos" w:hAnsi="Aptos" w:eastAsia="Aptos"/>
-                <w:b w:val="0"/>
-                <w:color w:val="22272B"/>
-                <w:sz w:val="16"/>
-              </w:rPr>
-              <w:t>200 full steps/rev x 256 microsteps</w:t>
-            </w:r>
-          </w:p>
-        </w:tc>
-        <w:tc>
-          <w:tcPr>
-            <w:tcW w:type="dxa" w:w="4608"/>
-            <w:shd w:fill="FFFFFF"/>
-            <w:tcMar>
-              <w:top w:w="65" w:type="dxa"/>
-              <w:start w:w="75" w:type="dxa"/>
-              <w:bottom w:w="65" w:type="dxa"/>
-              <w:end w:w="75" w:type="dxa"/>
-            </w:tcMar>
-            <w:vAlign w:val="center"/>
-            <w:tcBorders>
-              <w:top w:val="single" w:sz="3" w:color="AEB8C2"/>
-              <w:bottom w:val="single" w:sz="3" w:color="AEB8C2"/>
-              <w:start w:val="single" w:sz="3" w:color="AEB8C2"/>
-              <w:end w:val="single" w:sz="3" w:color="AEB8C2"/>
-            </w:tcBorders>
-          </w:tcPr>
-          <w:p>
-            <w:pPr>
-              <w:spacing w:after="0" w:line="240" w:lineRule="auto" w:before="0"/>
-            </w:pPr>
-            <w:r>
-              <w:rPr>
-                <w:rFonts w:ascii="Aptos" w:hAnsi="Aptos" w:eastAsia="Aptos"/>
-                <w:b w:val="0"/>
-                <w:color w:val="22272B"/>
-                <w:sz w:val="16"/>
-              </w:rPr>
-              <w:t>51,200 pulses per motor revolution.</w:t>
+            <w:tcW w:type="dxa" w:w="3427"/>
+            <w:vAlign w:val="center"/>
+          </w:tcPr>
+          <w:p>
+            <w:r>
+              <w:rPr>
+                <w:sz w:val="17"/>
+              </w:rPr>
+              <w:t>IPC version field</w:t>
+            </w:r>
+          </w:p>
+        </w:tc>
+        <w:tc>
+          <w:tcPr>
+            <w:tcW w:type="dxa" w:w="3427"/>
+            <w:vAlign w:val="center"/>
+          </w:tcPr>
+          <w:p>
+            <w:r>
+              <w:rPr>
+                <w:sz w:val="17"/>
+              </w:rPr>
+              <w:t>MOTION_IPC_VERSION is 1U and is stored directly in the published uint16_t version field.</w:t>
+            </w:r>
+          </w:p>
+        </w:tc>
+        <w:tc>
+          <w:tcPr>
+            <w:tcW w:type="dxa" w:w="3427"/>
+            <w:vAlign w:val="center"/>
+          </w:tcPr>
+          <w:p>
+            <w:r>
+              <w:rPr>
+                <w:sz w:val="17"/>
+              </w:rPr>
+              <w:t>Compile-time test asserts the version fits UINT16_MAX and the message remains 44 bytes.</w:t>
             </w:r>
           </w:p>
         </w:tc>
@@ -8741,100 +8626,43 @@
       <w:tr>
         <w:tc>
           <w:tcPr>
-            <w:tcW w:type="dxa" w:w="2448"/>
-            <w:shd w:fill="F3F5F7"/>
-            <w:tcMar>
-              <w:top w:w="65" w:type="dxa"/>
-              <w:start w:w="75" w:type="dxa"/>
-              <w:bottom w:w="65" w:type="dxa"/>
-              <w:end w:w="75" w:type="dxa"/>
-            </w:tcMar>
-            <w:vAlign w:val="center"/>
-            <w:tcBorders>
-              <w:top w:val="single" w:sz="3" w:color="AEB8C2"/>
-              <w:bottom w:val="single" w:sz="3" w:color="AEB8C2"/>
-              <w:start w:val="single" w:sz="3" w:color="AEB8C2"/>
-              <w:end w:val="single" w:sz="3" w:color="AEB8C2"/>
-            </w:tcBorders>
-          </w:tcPr>
-          <w:p>
-            <w:pPr>
-              <w:spacing w:after="0" w:line="240" w:lineRule="auto" w:before="0"/>
-            </w:pPr>
-            <w:r>
-              <w:rPr>
-                <w:rFonts w:ascii="Aptos" w:hAnsi="Aptos" w:eastAsia="Aptos"/>
-                <w:b/>
-                <w:color w:val="22272B"/>
-                <w:sz w:val="16"/>
-              </w:rPr>
-              <w:t>Gear ratio</w:t>
-            </w:r>
-          </w:p>
-        </w:tc>
-        <w:tc>
-          <w:tcPr>
-            <w:tcW w:type="dxa" w:w="3024"/>
-            <w:shd w:fill="F3F5F7"/>
-            <w:tcMar>
-              <w:top w:w="65" w:type="dxa"/>
-              <w:start w:w="75" w:type="dxa"/>
-              <w:bottom w:w="65" w:type="dxa"/>
-              <w:end w:w="75" w:type="dxa"/>
-            </w:tcMar>
-            <w:vAlign w:val="center"/>
-            <w:tcBorders>
-              <w:top w:val="single" w:sz="3" w:color="AEB8C2"/>
-              <w:bottom w:val="single" w:sz="3" w:color="AEB8C2"/>
-              <w:start w:val="single" w:sz="3" w:color="AEB8C2"/>
-              <w:end w:val="single" w:sz="3" w:color="AEB8C2"/>
-            </w:tcBorders>
-          </w:tcPr>
-          <w:p>
-            <w:pPr>
-              <w:spacing w:after="0" w:line="240" w:lineRule="auto" w:before="0"/>
-            </w:pPr>
-            <w:r>
-              <w:rPr>
-                <w:rFonts w:ascii="Aptos" w:hAnsi="Aptos" w:eastAsia="Aptos"/>
-                <w:b w:val="0"/>
-                <w:color w:val="22272B"/>
-                <w:sz w:val="16"/>
-              </w:rPr>
-              <w:t>24.65:1</w:t>
-            </w:r>
-          </w:p>
-        </w:tc>
-        <w:tc>
-          <w:tcPr>
-            <w:tcW w:type="dxa" w:w="4608"/>
-            <w:shd w:fill="F3F5F7"/>
-            <w:tcMar>
-              <w:top w:w="65" w:type="dxa"/>
-              <w:start w:w="75" w:type="dxa"/>
-              <w:bottom w:w="65" w:type="dxa"/>
-              <w:end w:w="75" w:type="dxa"/>
-            </w:tcMar>
-            <w:vAlign w:val="center"/>
-            <w:tcBorders>
-              <w:top w:val="single" w:sz="3" w:color="AEB8C2"/>
-              <w:bottom w:val="single" w:sz="3" w:color="AEB8C2"/>
-              <w:start w:val="single" w:sz="3" w:color="AEB8C2"/>
-              <w:end w:val="single" w:sz="3" w:color="AEB8C2"/>
-            </w:tcBorders>
-          </w:tcPr>
-          <w:p>
-            <w:pPr>
-              <w:spacing w:after="0" w:line="240" w:lineRule="auto" w:before="0"/>
-            </w:pPr>
-            <w:r>
-              <w:rPr>
-                <w:rFonts w:ascii="Aptos" w:hAnsi="Aptos" w:eastAsia="Aptos"/>
-                <w:b w:val="0"/>
-                <w:color w:val="22272B"/>
-                <w:sz w:val="16"/>
-              </w:rPr>
-              <w:t>Produces 1,262,080 pulses per table revolution.</w:t>
+            <w:tcW w:type="dxa" w:w="3427"/>
+            <w:vAlign w:val="center"/>
+          </w:tcPr>
+          <w:p>
+            <w:r>
+              <w:rPr>
+                <w:sz w:val="17"/>
+              </w:rPr>
+              <w:t>32-bit microsecond timebase</w:t>
+            </w:r>
+          </w:p>
+        </w:tc>
+        <w:tc>
+          <w:tcPr>
+            <w:tcW w:type="dxa" w:w="3427"/>
+            <w:vAlign w:val="center"/>
+          </w:tcPr>
+          <w:p>
+            <w:r>
+              <w:rPr>
+                <w:sz w:val="17"/>
+              </w:rPr>
+              <w:t>t_us is a uint32_t and wraps modulo 2^32 after about 71.6 minutes.</w:t>
+            </w:r>
+          </w:p>
+        </w:tc>
+        <w:tc>
+          <w:tcPr>
+            <w:tcW w:type="dxa" w:w="3427"/>
+            <w:vAlign w:val="center"/>
+          </w:tcPr>
+          <w:p>
+            <w:r>
+              <w:rPr>
+                <w:sz w:val="17"/>
+              </w:rPr>
+              <w:t>Host-side unwrapping uses modulo subtraction; the published test crosses UINT32_MAX and verifies monotonic reconstructed time.</w:t>
             </w:r>
           </w:p>
         </w:tc>
@@ -8842,521 +8670,52 @@
       <w:tr>
         <w:tc>
           <w:tcPr>
-            <w:tcW w:type="dxa" w:w="2448"/>
-            <w:shd w:fill="FFFFFF"/>
-            <w:tcMar>
-              <w:top w:w="65" w:type="dxa"/>
-              <w:start w:w="75" w:type="dxa"/>
-              <w:bottom w:w="65" w:type="dxa"/>
-              <w:end w:w="75" w:type="dxa"/>
-            </w:tcMar>
-            <w:vAlign w:val="center"/>
-            <w:tcBorders>
-              <w:top w:val="single" w:sz="3" w:color="AEB8C2"/>
-              <w:bottom w:val="single" w:sz="3" w:color="AEB8C2"/>
-              <w:start w:val="single" w:sz="3" w:color="AEB8C2"/>
-              <w:end w:val="single" w:sz="3" w:color="AEB8C2"/>
-            </w:tcBorders>
-          </w:tcPr>
-          <w:p>
-            <w:pPr>
-              <w:spacing w:after="0" w:line="240" w:lineRule="auto" w:before="0"/>
-            </w:pPr>
-            <w:r>
-              <w:rPr>
-                <w:rFonts w:ascii="Aptos" w:hAnsi="Aptos" w:eastAsia="Aptos"/>
-                <w:b/>
-                <w:color w:val="22272B"/>
-                <w:sz w:val="16"/>
-              </w:rPr>
-              <w:t>Command resolution</w:t>
-            </w:r>
-          </w:p>
-        </w:tc>
-        <w:tc>
-          <w:tcPr>
-            <w:tcW w:type="dxa" w:w="3024"/>
-            <w:shd w:fill="FFFFFF"/>
-            <w:tcMar>
-              <w:top w:w="65" w:type="dxa"/>
-              <w:start w:w="75" w:type="dxa"/>
-              <w:bottom w:w="65" w:type="dxa"/>
-              <w:end w:w="75" w:type="dxa"/>
-            </w:tcMar>
-            <w:vAlign w:val="center"/>
-            <w:tcBorders>
-              <w:top w:val="single" w:sz="3" w:color="AEB8C2"/>
-              <w:bottom w:val="single" w:sz="3" w:color="AEB8C2"/>
-              <w:start w:val="single" w:sz="3" w:color="AEB8C2"/>
-              <w:end w:val="single" w:sz="3" w:color="AEB8C2"/>
-            </w:tcBorders>
-          </w:tcPr>
-          <w:p>
-            <w:pPr>
-              <w:spacing w:after="0" w:line="240" w:lineRule="auto" w:before="0"/>
-            </w:pPr>
-            <w:r>
-              <w:rPr>
-                <w:rFonts w:ascii="Aptos" w:hAnsi="Aptos" w:eastAsia="Aptos"/>
-                <w:b w:val="0"/>
-                <w:color w:val="22272B"/>
-                <w:sz w:val="16"/>
-              </w:rPr>
-              <w:t>3,505.78 pulses/degree</w:t>
-            </w:r>
-          </w:p>
-        </w:tc>
-        <w:tc>
-          <w:tcPr>
-            <w:tcW w:type="dxa" w:w="4608"/>
-            <w:shd w:fill="FFFFFF"/>
-            <w:tcMar>
-              <w:top w:w="65" w:type="dxa"/>
-              <w:start w:w="75" w:type="dxa"/>
-              <w:bottom w:w="65" w:type="dxa"/>
-              <w:end w:w="75" w:type="dxa"/>
-            </w:tcMar>
-            <w:vAlign w:val="center"/>
-            <w:tcBorders>
-              <w:top w:val="single" w:sz="3" w:color="AEB8C2"/>
-              <w:bottom w:val="single" w:sz="3" w:color="AEB8C2"/>
-              <w:start w:val="single" w:sz="3" w:color="AEB8C2"/>
-              <w:end w:val="single" w:sz="3" w:color="AEB8C2"/>
-            </w:tcBorders>
-          </w:tcPr>
-          <w:p>
-            <w:pPr>
-              <w:spacing w:after="0" w:line="240" w:lineRule="auto" w:before="0"/>
-            </w:pPr>
-            <w:r>
-              <w:rPr>
-                <w:rFonts w:ascii="Aptos" w:hAnsi="Aptos" w:eastAsia="Aptos"/>
-                <w:b w:val="0"/>
-                <w:color w:val="22272B"/>
-                <w:sz w:val="16"/>
-              </w:rPr>
-              <w:t>Approximately 0.000285 degree per command pulse.</w:t>
-            </w:r>
-          </w:p>
-        </w:tc>
-      </w:tr>
-      <w:tr>
-        <w:tc>
-          <w:tcPr>
-            <w:tcW w:type="dxa" w:w="2448"/>
-            <w:shd w:fill="F3F5F7"/>
-            <w:tcMar>
-              <w:top w:w="65" w:type="dxa"/>
-              <w:start w:w="75" w:type="dxa"/>
-              <w:bottom w:w="65" w:type="dxa"/>
-              <w:end w:w="75" w:type="dxa"/>
-            </w:tcMar>
-            <w:vAlign w:val="center"/>
-            <w:tcBorders>
-              <w:top w:val="single" w:sz="3" w:color="AEB8C2"/>
-              <w:bottom w:val="single" w:sz="3" w:color="AEB8C2"/>
-              <w:start w:val="single" w:sz="3" w:color="AEB8C2"/>
-              <w:end w:val="single" w:sz="3" w:color="AEB8C2"/>
-            </w:tcBorders>
-          </w:tcPr>
-          <w:p>
-            <w:pPr>
-              <w:spacing w:after="0" w:line="240" w:lineRule="auto" w:before="0"/>
-            </w:pPr>
-            <w:r>
-              <w:rPr>
-                <w:rFonts w:ascii="Aptos" w:hAnsi="Aptos" w:eastAsia="Aptos"/>
-                <w:b/>
-                <w:color w:val="22272B"/>
-                <w:sz w:val="16"/>
-              </w:rPr>
-              <w:t>Encoder decoding</w:t>
-            </w:r>
-          </w:p>
-        </w:tc>
-        <w:tc>
-          <w:tcPr>
-            <w:tcW w:type="dxa" w:w="3024"/>
-            <w:shd w:fill="F3F5F7"/>
-            <w:tcMar>
-              <w:top w:w="65" w:type="dxa"/>
-              <w:start w:w="75" w:type="dxa"/>
-              <w:bottom w:w="65" w:type="dxa"/>
-              <w:end w:w="75" w:type="dxa"/>
-            </w:tcMar>
-            <w:vAlign w:val="center"/>
-            <w:tcBorders>
-              <w:top w:val="single" w:sz="3" w:color="AEB8C2"/>
-              <w:bottom w:val="single" w:sz="3" w:color="AEB8C2"/>
-              <w:start w:val="single" w:sz="3" w:color="AEB8C2"/>
-              <w:end w:val="single" w:sz="3" w:color="AEB8C2"/>
-            </w:tcBorders>
-          </w:tcPr>
-          <w:p>
-            <w:pPr>
-              <w:spacing w:after="0" w:line="240" w:lineRule="auto" w:before="0"/>
-            </w:pPr>
-            <w:r>
-              <w:rPr>
-                <w:rFonts w:ascii="Aptos" w:hAnsi="Aptos" w:eastAsia="Aptos"/>
-                <w:b w:val="0"/>
-                <w:color w:val="22272B"/>
-                <w:sz w:val="16"/>
-              </w:rPr>
-              <w:t>5,000 CPR, A-channel CHANGE x2</w:t>
-            </w:r>
-          </w:p>
-        </w:tc>
-        <w:tc>
-          <w:tcPr>
-            <w:tcW w:type="dxa" w:w="4608"/>
-            <w:shd w:fill="F3F5F7"/>
-            <w:tcMar>
-              <w:top w:w="65" w:type="dxa"/>
-              <w:start w:w="75" w:type="dxa"/>
-              <w:bottom w:w="65" w:type="dxa"/>
-              <w:end w:w="75" w:type="dxa"/>
-            </w:tcMar>
-            <w:vAlign w:val="center"/>
-            <w:tcBorders>
-              <w:top w:val="single" w:sz="3" w:color="AEB8C2"/>
-              <w:bottom w:val="single" w:sz="3" w:color="AEB8C2"/>
-              <w:start w:val="single" w:sz="3" w:color="AEB8C2"/>
-              <w:end w:val="single" w:sz="3" w:color="AEB8C2"/>
-            </w:tcBorders>
-          </w:tcPr>
-          <w:p>
-            <w:pPr>
-              <w:spacing w:after="0" w:line="240" w:lineRule="auto" w:before="0"/>
-            </w:pPr>
-            <w:r>
-              <w:rPr>
-                <w:rFonts w:ascii="Aptos" w:hAnsi="Aptos" w:eastAsia="Aptos"/>
-                <w:b w:val="0"/>
-                <w:color w:val="22272B"/>
-                <w:sz w:val="16"/>
-              </w:rPr>
-              <w:t>10,000 motor-shaft counts/rev.</w:t>
-            </w:r>
-          </w:p>
-        </w:tc>
-      </w:tr>
-      <w:tr>
-        <w:tc>
-          <w:tcPr>
-            <w:tcW w:type="dxa" w:w="2448"/>
-            <w:shd w:fill="FFFFFF"/>
-            <w:tcMar>
-              <w:top w:w="65" w:type="dxa"/>
-              <w:start w:w="75" w:type="dxa"/>
-              <w:bottom w:w="65" w:type="dxa"/>
-              <w:end w:w="75" w:type="dxa"/>
-            </w:tcMar>
-            <w:vAlign w:val="center"/>
-            <w:tcBorders>
-              <w:top w:val="single" w:sz="3" w:color="AEB8C2"/>
-              <w:bottom w:val="single" w:sz="3" w:color="AEB8C2"/>
-              <w:start w:val="single" w:sz="3" w:color="AEB8C2"/>
-              <w:end w:val="single" w:sz="3" w:color="AEB8C2"/>
-            </w:tcBorders>
-          </w:tcPr>
-          <w:p>
-            <w:pPr>
-              <w:spacing w:after="0" w:line="240" w:lineRule="auto" w:before="0"/>
-            </w:pPr>
-            <w:r>
-              <w:rPr>
-                <w:rFonts w:ascii="Aptos" w:hAnsi="Aptos" w:eastAsia="Aptos"/>
-                <w:b/>
-                <w:color w:val="22272B"/>
-                <w:sz w:val="16"/>
-              </w:rPr>
-              <w:t>Table encoder scale</w:t>
-            </w:r>
-          </w:p>
-        </w:tc>
-        <w:tc>
-          <w:tcPr>
-            <w:tcW w:type="dxa" w:w="3024"/>
-            <w:shd w:fill="FFFFFF"/>
-            <w:tcMar>
-              <w:top w:w="65" w:type="dxa"/>
-              <w:start w:w="75" w:type="dxa"/>
-              <w:bottom w:w="65" w:type="dxa"/>
-              <w:end w:w="75" w:type="dxa"/>
-            </w:tcMar>
-            <w:vAlign w:val="center"/>
-            <w:tcBorders>
-              <w:top w:val="single" w:sz="3" w:color="AEB8C2"/>
-              <w:bottom w:val="single" w:sz="3" w:color="AEB8C2"/>
-              <w:start w:val="single" w:sz="3" w:color="AEB8C2"/>
-              <w:end w:val="single" w:sz="3" w:color="AEB8C2"/>
-            </w:tcBorders>
-          </w:tcPr>
-          <w:p>
-            <w:pPr>
-              <w:spacing w:after="0" w:line="240" w:lineRule="auto" w:before="0"/>
-            </w:pPr>
-            <w:r>
-              <w:rPr>
-                <w:rFonts w:ascii="Aptos" w:hAnsi="Aptos" w:eastAsia="Aptos"/>
-                <w:b w:val="0"/>
-                <w:color w:val="22272B"/>
-                <w:sz w:val="16"/>
-              </w:rPr>
-              <w:t>246,500 counts/rev</w:t>
-            </w:r>
-          </w:p>
-        </w:tc>
-        <w:tc>
-          <w:tcPr>
-            <w:tcW w:type="dxa" w:w="4608"/>
-            <w:shd w:fill="FFFFFF"/>
-            <w:tcMar>
-              <w:top w:w="65" w:type="dxa"/>
-              <w:start w:w="75" w:type="dxa"/>
-              <w:bottom w:w="65" w:type="dxa"/>
-              <w:end w:w="75" w:type="dxa"/>
-            </w:tcMar>
-            <w:vAlign w:val="center"/>
-            <w:tcBorders>
-              <w:top w:val="single" w:sz="3" w:color="AEB8C2"/>
-              <w:bottom w:val="single" w:sz="3" w:color="AEB8C2"/>
-              <w:start w:val="single" w:sz="3" w:color="AEB8C2"/>
-              <w:end w:val="single" w:sz="3" w:color="AEB8C2"/>
-            </w:tcBorders>
-          </w:tcPr>
-          <w:p>
-            <w:pPr>
-              <w:spacing w:after="0" w:line="240" w:lineRule="auto" w:before="0"/>
-            </w:pPr>
-            <w:r>
-              <w:rPr>
-                <w:rFonts w:ascii="Aptos" w:hAnsi="Aptos" w:eastAsia="Aptos"/>
-                <w:b w:val="0"/>
-                <w:color w:val="22272B"/>
-                <w:sz w:val="16"/>
-              </w:rPr>
-              <w:t>684.72 counts/degree, approximately 0.001460 degree/count.</w:t>
-            </w:r>
-          </w:p>
-        </w:tc>
-      </w:tr>
-      <w:tr>
-        <w:tc>
-          <w:tcPr>
-            <w:tcW w:type="dxa" w:w="2448"/>
-            <w:shd w:fill="F3F5F7"/>
-            <w:tcMar>
-              <w:top w:w="65" w:type="dxa"/>
-              <w:start w:w="75" w:type="dxa"/>
-              <w:bottom w:w="65" w:type="dxa"/>
-              <w:end w:w="75" w:type="dxa"/>
-            </w:tcMar>
-            <w:vAlign w:val="center"/>
-            <w:tcBorders>
-              <w:top w:val="single" w:sz="3" w:color="AEB8C2"/>
-              <w:bottom w:val="single" w:sz="3" w:color="AEB8C2"/>
-              <w:start w:val="single" w:sz="3" w:color="AEB8C2"/>
-              <w:end w:val="single" w:sz="3" w:color="AEB8C2"/>
-            </w:tcBorders>
-          </w:tcPr>
-          <w:p>
-            <w:pPr>
-              <w:spacing w:after="0" w:line="240" w:lineRule="auto" w:before="0"/>
-            </w:pPr>
-            <w:r>
-              <w:rPr>
-                <w:rFonts w:ascii="Aptos" w:hAnsi="Aptos" w:eastAsia="Aptos"/>
-                <w:b/>
-                <w:color w:val="22272B"/>
-                <w:sz w:val="16"/>
-              </w:rPr>
-              <w:t>Correction gain</w:t>
-            </w:r>
-          </w:p>
-        </w:tc>
-        <w:tc>
-          <w:tcPr>
-            <w:tcW w:type="dxa" w:w="3024"/>
-            <w:shd w:fill="F3F5F7"/>
-            <w:tcMar>
-              <w:top w:w="65" w:type="dxa"/>
-              <w:start w:w="75" w:type="dxa"/>
-              <w:bottom w:w="65" w:type="dxa"/>
-              <w:end w:w="75" w:type="dxa"/>
-            </w:tcMar>
-            <w:vAlign w:val="center"/>
-            <w:tcBorders>
-              <w:top w:val="single" w:sz="3" w:color="AEB8C2"/>
-              <w:bottom w:val="single" w:sz="3" w:color="AEB8C2"/>
-              <w:start w:val="single" w:sz="3" w:color="AEB8C2"/>
-              <w:end w:val="single" w:sz="3" w:color="AEB8C2"/>
-            </w:tcBorders>
-          </w:tcPr>
-          <w:p>
-            <w:pPr>
-              <w:spacing w:after="0" w:line="240" w:lineRule="auto" w:before="0"/>
-            </w:pPr>
-            <w:r>
-              <w:rPr>
-                <w:rFonts w:ascii="Aptos" w:hAnsi="Aptos" w:eastAsia="Aptos"/>
-                <w:b w:val="0"/>
-                <w:color w:val="22272B"/>
-                <w:sz w:val="16"/>
-              </w:rPr>
-              <w:t>20 pulse-Hz/degree</w:t>
-            </w:r>
-          </w:p>
-        </w:tc>
-        <w:tc>
-          <w:tcPr>
-            <w:tcW w:type="dxa" w:w="4608"/>
-            <w:shd w:fill="F3F5F7"/>
-            <w:tcMar>
-              <w:top w:w="65" w:type="dxa"/>
-              <w:start w:w="75" w:type="dxa"/>
-              <w:bottom w:w="65" w:type="dxa"/>
-              <w:end w:w="75" w:type="dxa"/>
-            </w:tcMar>
-            <w:vAlign w:val="center"/>
-            <w:tcBorders>
-              <w:top w:val="single" w:sz="3" w:color="AEB8C2"/>
-              <w:bottom w:val="single" w:sz="3" w:color="AEB8C2"/>
-              <w:start w:val="single" w:sz="3" w:color="AEB8C2"/>
-              <w:end w:val="single" w:sz="3" w:color="AEB8C2"/>
-            </w:tcBorders>
-          </w:tcPr>
-          <w:p>
-            <w:pPr>
-              <w:spacing w:after="0" w:line="240" w:lineRule="auto" w:before="0"/>
-            </w:pPr>
-            <w:r>
-              <w:rPr>
-                <w:rFonts w:ascii="Aptos" w:hAnsi="Aptos" w:eastAsia="Aptos"/>
-                <w:b w:val="0"/>
-                <w:color w:val="22272B"/>
-                <w:sz w:val="16"/>
-              </w:rPr>
-              <w:t>Closed-loop correction term applied to feedforward command.</w:t>
-            </w:r>
-          </w:p>
-        </w:tc>
-      </w:tr>
-      <w:tr>
-        <w:tc>
-          <w:tcPr>
-            <w:tcW w:type="dxa" w:w="2448"/>
-            <w:shd w:fill="FFFFFF"/>
-            <w:tcMar>
-              <w:top w:w="65" w:type="dxa"/>
-              <w:start w:w="75" w:type="dxa"/>
-              <w:bottom w:w="65" w:type="dxa"/>
-              <w:end w:w="75" w:type="dxa"/>
-            </w:tcMar>
-            <w:vAlign w:val="center"/>
-            <w:tcBorders>
-              <w:top w:val="single" w:sz="3" w:color="AEB8C2"/>
-              <w:bottom w:val="single" w:sz="3" w:color="AEB8C2"/>
-              <w:start w:val="single" w:sz="3" w:color="AEB8C2"/>
-              <w:end w:val="single" w:sz="3" w:color="AEB8C2"/>
-            </w:tcBorders>
-          </w:tcPr>
-          <w:p>
-            <w:pPr>
-              <w:spacing w:after="0" w:line="240" w:lineRule="auto" w:before="0"/>
-            </w:pPr>
-            <w:r>
-              <w:rPr>
-                <w:rFonts w:ascii="Aptos" w:hAnsi="Aptos" w:eastAsia="Aptos"/>
-                <w:b/>
-                <w:color w:val="22272B"/>
-                <w:sz w:val="16"/>
-              </w:rPr>
-              <w:t>Correction limits</w:t>
-            </w:r>
-          </w:p>
-        </w:tc>
-        <w:tc>
-          <w:tcPr>
-            <w:tcW w:type="dxa" w:w="3024"/>
-            <w:shd w:fill="FFFFFF"/>
-            <w:tcMar>
-              <w:top w:w="65" w:type="dxa"/>
-              <w:start w:w="75" w:type="dxa"/>
-              <w:bottom w:w="65" w:type="dxa"/>
-              <w:end w:w="75" w:type="dxa"/>
-            </w:tcMar>
-            <w:vAlign w:val="center"/>
-            <w:tcBorders>
-              <w:top w:val="single" w:sz="3" w:color="AEB8C2"/>
-              <w:bottom w:val="single" w:sz="3" w:color="AEB8C2"/>
-              <w:start w:val="single" w:sz="3" w:color="AEB8C2"/>
-              <w:end w:val="single" w:sz="3" w:color="AEB8C2"/>
-            </w:tcBorders>
-          </w:tcPr>
-          <w:p>
-            <w:pPr>
-              <w:spacing w:after="0" w:line="240" w:lineRule="auto" w:before="0"/>
-            </w:pPr>
-            <w:r>
-              <w:rPr>
-                <w:rFonts w:ascii="Aptos" w:hAnsi="Aptos" w:eastAsia="Aptos"/>
-                <w:b w:val="0"/>
-                <w:color w:val="22272B"/>
-                <w:sz w:val="16"/>
-              </w:rPr>
-              <w:t>250 Hz absolute and 5% of feedforward relative</w:t>
-            </w:r>
-          </w:p>
-        </w:tc>
-        <w:tc>
-          <w:tcPr>
-            <w:tcW w:type="dxa" w:w="4608"/>
-            <w:shd w:fill="FFFFFF"/>
-            <w:tcMar>
-              <w:top w:w="65" w:type="dxa"/>
-              <w:start w:w="75" w:type="dxa"/>
-              <w:bottom w:w="65" w:type="dxa"/>
-              <w:end w:w="75" w:type="dxa"/>
-            </w:tcMar>
-            <w:vAlign w:val="center"/>
-            <w:tcBorders>
-              <w:top w:val="single" w:sz="3" w:color="AEB8C2"/>
-              <w:bottom w:val="single" w:sz="3" w:color="AEB8C2"/>
-              <w:start w:val="single" w:sz="3" w:color="AEB8C2"/>
-              <w:end w:val="single" w:sz="3" w:color="AEB8C2"/>
-            </w:tcBorders>
-          </w:tcPr>
-          <w:p>
-            <w:pPr>
-              <w:spacing w:after="0" w:line="240" w:lineRule="auto" w:before="0"/>
-            </w:pPr>
-            <w:r>
-              <w:rPr>
-                <w:rFonts w:ascii="Aptos" w:hAnsi="Aptos" w:eastAsia="Aptos"/>
-                <w:b w:val="0"/>
-                <w:color w:val="22272B"/>
-                <w:sz w:val="16"/>
-              </w:rPr>
-              <w:t>Prevents the correction term from dominating commanded motion.</w:t>
+            <w:tcW w:type="dxa" w:w="3427"/>
+            <w:vAlign w:val="center"/>
+          </w:tcPr>
+          <w:p>
+            <w:r>
+              <w:rPr>
+                <w:sz w:val="17"/>
+              </w:rPr>
+              <w:t>Cache-coherency evidence boundary</w:t>
+            </w:r>
+          </w:p>
+        </w:tc>
+        <w:tc>
+          <w:tcPr>
+            <w:tcW w:type="dxa" w:w="3427"/>
+            <w:vAlign w:val="center"/>
+          </w:tcPr>
+          <w:p>
+            <w:r>
+              <w:rPr>
+                <w:sz w:val="17"/>
+              </w:rPr>
+              <w:t>Public headers define alignment and memory placement. Complete MPU setup, ordering barriers, cache policy, and producer/consumer publication logic remain in the controlled private implementation.</w:t>
+            </w:r>
+          </w:p>
+        </w:tc>
+        <w:tc>
+          <w:tcPr>
+            <w:tcW w:type="dxa" w:w="3427"/>
+            <w:vAlign w:val="center"/>
+          </w:tcPr>
+          <w:p>
+            <w:r>
+              <w:rPr>
+                <w:sz w:val="17"/>
+              </w:rPr>
+              <w:t>Public claims are limited to the exposed layout contract; full coherency behavior requires review of the private implementation.</w:t>
             </w:r>
           </w:p>
         </w:tc>
       </w:tr>
     </w:tbl>
     <w:p>
-      <w:pPr>
-        <w:spacing w:before="0" w:after="100" w:line="259" w:lineRule="auto"/>
-      </w:pPr>
+      <w:pPr/>
       <w:r>
-        <w:rPr>
-          <w:rFonts w:ascii="Aptos" w:hAnsi="Aptos" w:eastAsia="Aptos"/>
-          <w:b/>
-          <w:color w:val="22272B"/>
-          <w:sz w:val="19"/>
-        </w:rPr>
-        <w:t>8.3 Measured Operating Results</w:t>
+        <w:t>These corrections address the public review boundary directly: the ring can no longer silently outgrow its reservation, the protocol version has one unambiguous wire representation, and long-run timestamp behavior has an executable wrap test. The complete cache/MPU and producer/consumer implementation remains private and is therefore not represented as independently validated by the public excerpts.</w:t>
       </w:r>
     </w:p>
     <w:tbl>
@@ -9378,6 +8737,842 @@
         </w:trPr>
         <w:tc>
           <w:tcPr>
+            <w:tcW w:type="dxa" w:w="2448"/>
+            <w:shd w:fill="20364F"/>
+            <w:tcMar>
+              <w:top w:w="65" w:type="dxa"/>
+              <w:start w:w="75" w:type="dxa"/>
+              <w:bottom w:w="65" w:type="dxa"/>
+              <w:end w:w="75" w:type="dxa"/>
+            </w:tcMar>
+            <w:vAlign w:val="center"/>
+            <w:tcBorders>
+              <w:top w:val="single" w:sz="3" w:color="AEB8C2"/>
+              <w:bottom w:val="single" w:sz="3" w:color="AEB8C2"/>
+              <w:start w:val="single" w:sz="3" w:color="AEB8C2"/>
+              <w:end w:val="single" w:sz="3" w:color="AEB8C2"/>
+            </w:tcBorders>
+          </w:tcPr>
+          <w:p>
+            <w:pPr>
+              <w:spacing w:after="0" w:line="240" w:lineRule="auto" w:before="0"/>
+              <w:jc w:val="center"/>
+            </w:pPr>
+            <w:r>
+              <w:rPr>
+                <w:rFonts w:ascii="Aptos" w:hAnsi="Aptos" w:eastAsia="Aptos"/>
+                <w:b/>
+                <w:color w:val="FFFFFF"/>
+                <w:sz w:val="16"/>
+              </w:rPr>
+              <w:t>Quantity</w:t>
+            </w:r>
+          </w:p>
+        </w:tc>
+        <w:tc>
+          <w:tcPr>
+            <w:tcW w:type="dxa" w:w="3024"/>
+            <w:shd w:fill="20364F"/>
+            <w:tcMar>
+              <w:top w:w="65" w:type="dxa"/>
+              <w:start w:w="75" w:type="dxa"/>
+              <w:bottom w:w="65" w:type="dxa"/>
+              <w:end w:w="75" w:type="dxa"/>
+            </w:tcMar>
+            <w:vAlign w:val="center"/>
+            <w:tcBorders>
+              <w:top w:val="single" w:sz="3" w:color="AEB8C2"/>
+              <w:bottom w:val="single" w:sz="3" w:color="AEB8C2"/>
+              <w:start w:val="single" w:sz="3" w:color="AEB8C2"/>
+              <w:end w:val="single" w:sz="3" w:color="AEB8C2"/>
+            </w:tcBorders>
+          </w:tcPr>
+          <w:p>
+            <w:pPr>
+              <w:spacing w:after="0" w:line="240" w:lineRule="auto" w:before="0"/>
+              <w:jc w:val="center"/>
+            </w:pPr>
+            <w:r>
+              <w:rPr>
+                <w:rFonts w:ascii="Aptos" w:hAnsi="Aptos" w:eastAsia="Aptos"/>
+                <w:b/>
+                <w:color w:val="FFFFFF"/>
+                <w:sz w:val="16"/>
+              </w:rPr>
+              <w:t>Calculation / value</w:t>
+            </w:r>
+          </w:p>
+        </w:tc>
+        <w:tc>
+          <w:tcPr>
+            <w:tcW w:type="dxa" w:w="4608"/>
+            <w:shd w:fill="20364F"/>
+            <w:tcMar>
+              <w:top w:w="65" w:type="dxa"/>
+              <w:start w:w="75" w:type="dxa"/>
+              <w:bottom w:w="65" w:type="dxa"/>
+              <w:end w:w="75" w:type="dxa"/>
+            </w:tcMar>
+            <w:vAlign w:val="center"/>
+            <w:tcBorders>
+              <w:top w:val="single" w:sz="3" w:color="AEB8C2"/>
+              <w:bottom w:val="single" w:sz="3" w:color="AEB8C2"/>
+              <w:start w:val="single" w:sz="3" w:color="AEB8C2"/>
+              <w:end w:val="single" w:sz="3" w:color="AEB8C2"/>
+            </w:tcBorders>
+          </w:tcPr>
+          <w:p>
+            <w:pPr>
+              <w:spacing w:after="0" w:line="240" w:lineRule="auto" w:before="0"/>
+              <w:jc w:val="center"/>
+            </w:pPr>
+            <w:r>
+              <w:rPr>
+                <w:rFonts w:ascii="Aptos" w:hAnsi="Aptos" w:eastAsia="Aptos"/>
+                <w:b/>
+                <w:color w:val="FFFFFF"/>
+                <w:sz w:val="16"/>
+              </w:rPr>
+              <w:t>Interpretation</w:t>
+            </w:r>
+          </w:p>
+        </w:tc>
+      </w:tr>
+      <w:tr>
+        <w:tc>
+          <w:tcPr>
+            <w:tcW w:type="dxa" w:w="2448"/>
+            <w:shd w:fill="FFFFFF"/>
+            <w:tcMar>
+              <w:top w:w="65" w:type="dxa"/>
+              <w:start w:w="75" w:type="dxa"/>
+              <w:bottom w:w="65" w:type="dxa"/>
+              <w:end w:w="75" w:type="dxa"/>
+            </w:tcMar>
+            <w:vAlign w:val="center"/>
+            <w:tcBorders>
+              <w:top w:val="single" w:sz="3" w:color="AEB8C2"/>
+              <w:bottom w:val="single" w:sz="3" w:color="AEB8C2"/>
+              <w:start w:val="single" w:sz="3" w:color="AEB8C2"/>
+              <w:end w:val="single" w:sz="3" w:color="AEB8C2"/>
+            </w:tcBorders>
+          </w:tcPr>
+          <w:p>
+            <w:pPr>
+              <w:spacing w:after="0" w:line="240" w:lineRule="auto" w:before="0"/>
+            </w:pPr>
+            <w:r>
+              <w:rPr>
+                <w:rFonts w:ascii="Aptos" w:hAnsi="Aptos" w:eastAsia="Aptos"/>
+                <w:b/>
+                <w:color w:val="22272B"/>
+                <w:sz w:val="16"/>
+              </w:rPr>
+              <w:t>Motor steps</w:t>
+            </w:r>
+          </w:p>
+        </w:tc>
+        <w:tc>
+          <w:tcPr>
+            <w:tcW w:type="dxa" w:w="3024"/>
+            <w:shd w:fill="FFFFFF"/>
+            <w:tcMar>
+              <w:top w:w="65" w:type="dxa"/>
+              <w:start w:w="75" w:type="dxa"/>
+              <w:bottom w:w="65" w:type="dxa"/>
+              <w:end w:w="75" w:type="dxa"/>
+            </w:tcMar>
+            <w:vAlign w:val="center"/>
+            <w:tcBorders>
+              <w:top w:val="single" w:sz="3" w:color="AEB8C2"/>
+              <w:bottom w:val="single" w:sz="3" w:color="AEB8C2"/>
+              <w:start w:val="single" w:sz="3" w:color="AEB8C2"/>
+              <w:end w:val="single" w:sz="3" w:color="AEB8C2"/>
+            </w:tcBorders>
+          </w:tcPr>
+          <w:p>
+            <w:pPr>
+              <w:spacing w:after="0" w:line="240" w:lineRule="auto" w:before="0"/>
+            </w:pPr>
+            <w:r>
+              <w:rPr>
+                <w:rFonts w:ascii="Aptos" w:hAnsi="Aptos" w:eastAsia="Aptos"/>
+                <w:b w:val="0"/>
+                <w:color w:val="22272B"/>
+                <w:sz w:val="16"/>
+              </w:rPr>
+              <w:t>200 full steps/rev x 256 microsteps</w:t>
+            </w:r>
+          </w:p>
+        </w:tc>
+        <w:tc>
+          <w:tcPr>
+            <w:tcW w:type="dxa" w:w="4608"/>
+            <w:shd w:fill="FFFFFF"/>
+            <w:tcMar>
+              <w:top w:w="65" w:type="dxa"/>
+              <w:start w:w="75" w:type="dxa"/>
+              <w:bottom w:w="65" w:type="dxa"/>
+              <w:end w:w="75" w:type="dxa"/>
+            </w:tcMar>
+            <w:vAlign w:val="center"/>
+            <w:tcBorders>
+              <w:top w:val="single" w:sz="3" w:color="AEB8C2"/>
+              <w:bottom w:val="single" w:sz="3" w:color="AEB8C2"/>
+              <w:start w:val="single" w:sz="3" w:color="AEB8C2"/>
+              <w:end w:val="single" w:sz="3" w:color="AEB8C2"/>
+            </w:tcBorders>
+          </w:tcPr>
+          <w:p>
+            <w:pPr>
+              <w:spacing w:after="0" w:line="240" w:lineRule="auto" w:before="0"/>
+            </w:pPr>
+            <w:r>
+              <w:rPr>
+                <w:rFonts w:ascii="Aptos" w:hAnsi="Aptos" w:eastAsia="Aptos"/>
+                <w:b w:val="0"/>
+                <w:color w:val="22272B"/>
+                <w:sz w:val="16"/>
+              </w:rPr>
+              <w:t>51,200 pulses per motor revolution.</w:t>
+            </w:r>
+          </w:p>
+        </w:tc>
+      </w:tr>
+      <w:tr>
+        <w:tc>
+          <w:tcPr>
+            <w:tcW w:type="dxa" w:w="2448"/>
+            <w:shd w:fill="F3F5F7"/>
+            <w:tcMar>
+              <w:top w:w="65" w:type="dxa"/>
+              <w:start w:w="75" w:type="dxa"/>
+              <w:bottom w:w="65" w:type="dxa"/>
+              <w:end w:w="75" w:type="dxa"/>
+            </w:tcMar>
+            <w:vAlign w:val="center"/>
+            <w:tcBorders>
+              <w:top w:val="single" w:sz="3" w:color="AEB8C2"/>
+              <w:bottom w:val="single" w:sz="3" w:color="AEB8C2"/>
+              <w:start w:val="single" w:sz="3" w:color="AEB8C2"/>
+              <w:end w:val="single" w:sz="3" w:color="AEB8C2"/>
+            </w:tcBorders>
+          </w:tcPr>
+          <w:p>
+            <w:pPr>
+              <w:spacing w:after="0" w:line="240" w:lineRule="auto" w:before="0"/>
+            </w:pPr>
+            <w:r>
+              <w:rPr>
+                <w:rFonts w:ascii="Aptos" w:hAnsi="Aptos" w:eastAsia="Aptos"/>
+                <w:b/>
+                <w:color w:val="22272B"/>
+                <w:sz w:val="16"/>
+              </w:rPr>
+              <w:t>Gear ratio</w:t>
+            </w:r>
+          </w:p>
+        </w:tc>
+        <w:tc>
+          <w:tcPr>
+            <w:tcW w:type="dxa" w:w="3024"/>
+            <w:shd w:fill="F3F5F7"/>
+            <w:tcMar>
+              <w:top w:w="65" w:type="dxa"/>
+              <w:start w:w="75" w:type="dxa"/>
+              <w:bottom w:w="65" w:type="dxa"/>
+              <w:end w:w="75" w:type="dxa"/>
+            </w:tcMar>
+            <w:vAlign w:val="center"/>
+            <w:tcBorders>
+              <w:top w:val="single" w:sz="3" w:color="AEB8C2"/>
+              <w:bottom w:val="single" w:sz="3" w:color="AEB8C2"/>
+              <w:start w:val="single" w:sz="3" w:color="AEB8C2"/>
+              <w:end w:val="single" w:sz="3" w:color="AEB8C2"/>
+            </w:tcBorders>
+          </w:tcPr>
+          <w:p>
+            <w:pPr>
+              <w:spacing w:after="0" w:line="240" w:lineRule="auto" w:before="0"/>
+            </w:pPr>
+            <w:r>
+              <w:rPr>
+                <w:rFonts w:ascii="Aptos" w:hAnsi="Aptos" w:eastAsia="Aptos"/>
+                <w:b w:val="0"/>
+                <w:color w:val="22272B"/>
+                <w:sz w:val="16"/>
+              </w:rPr>
+              <w:t>24.65:1</w:t>
+            </w:r>
+          </w:p>
+        </w:tc>
+        <w:tc>
+          <w:tcPr>
+            <w:tcW w:type="dxa" w:w="4608"/>
+            <w:shd w:fill="F3F5F7"/>
+            <w:tcMar>
+              <w:top w:w="65" w:type="dxa"/>
+              <w:start w:w="75" w:type="dxa"/>
+              <w:bottom w:w="65" w:type="dxa"/>
+              <w:end w:w="75" w:type="dxa"/>
+            </w:tcMar>
+            <w:vAlign w:val="center"/>
+            <w:tcBorders>
+              <w:top w:val="single" w:sz="3" w:color="AEB8C2"/>
+              <w:bottom w:val="single" w:sz="3" w:color="AEB8C2"/>
+              <w:start w:val="single" w:sz="3" w:color="AEB8C2"/>
+              <w:end w:val="single" w:sz="3" w:color="AEB8C2"/>
+            </w:tcBorders>
+          </w:tcPr>
+          <w:p>
+            <w:pPr>
+              <w:spacing w:after="0" w:line="240" w:lineRule="auto" w:before="0"/>
+            </w:pPr>
+            <w:r>
+              <w:rPr>
+                <w:rFonts w:ascii="Aptos" w:hAnsi="Aptos" w:eastAsia="Aptos"/>
+                <w:b w:val="0"/>
+                <w:color w:val="22272B"/>
+                <w:sz w:val="16"/>
+              </w:rPr>
+              <w:t>Produces 1,262,080 pulses per table revolution.</w:t>
+            </w:r>
+          </w:p>
+        </w:tc>
+      </w:tr>
+      <w:tr>
+        <w:tc>
+          <w:tcPr>
+            <w:tcW w:type="dxa" w:w="2448"/>
+            <w:shd w:fill="FFFFFF"/>
+            <w:tcMar>
+              <w:top w:w="65" w:type="dxa"/>
+              <w:start w:w="75" w:type="dxa"/>
+              <w:bottom w:w="65" w:type="dxa"/>
+              <w:end w:w="75" w:type="dxa"/>
+            </w:tcMar>
+            <w:vAlign w:val="center"/>
+            <w:tcBorders>
+              <w:top w:val="single" w:sz="3" w:color="AEB8C2"/>
+              <w:bottom w:val="single" w:sz="3" w:color="AEB8C2"/>
+              <w:start w:val="single" w:sz="3" w:color="AEB8C2"/>
+              <w:end w:val="single" w:sz="3" w:color="AEB8C2"/>
+            </w:tcBorders>
+          </w:tcPr>
+          <w:p>
+            <w:pPr>
+              <w:spacing w:after="0" w:line="240" w:lineRule="auto" w:before="0"/>
+            </w:pPr>
+            <w:r>
+              <w:rPr>
+                <w:rFonts w:ascii="Aptos" w:hAnsi="Aptos" w:eastAsia="Aptos"/>
+                <w:b/>
+                <w:color w:val="22272B"/>
+                <w:sz w:val="16"/>
+              </w:rPr>
+              <w:t>Command resolution</w:t>
+            </w:r>
+          </w:p>
+        </w:tc>
+        <w:tc>
+          <w:tcPr>
+            <w:tcW w:type="dxa" w:w="3024"/>
+            <w:shd w:fill="FFFFFF"/>
+            <w:tcMar>
+              <w:top w:w="65" w:type="dxa"/>
+              <w:start w:w="75" w:type="dxa"/>
+              <w:bottom w:w="65" w:type="dxa"/>
+              <w:end w:w="75" w:type="dxa"/>
+            </w:tcMar>
+            <w:vAlign w:val="center"/>
+            <w:tcBorders>
+              <w:top w:val="single" w:sz="3" w:color="AEB8C2"/>
+              <w:bottom w:val="single" w:sz="3" w:color="AEB8C2"/>
+              <w:start w:val="single" w:sz="3" w:color="AEB8C2"/>
+              <w:end w:val="single" w:sz="3" w:color="AEB8C2"/>
+            </w:tcBorders>
+          </w:tcPr>
+          <w:p>
+            <w:pPr>
+              <w:spacing w:after="0" w:line="240" w:lineRule="auto" w:before="0"/>
+            </w:pPr>
+            <w:r>
+              <w:rPr>
+                <w:rFonts w:ascii="Aptos" w:hAnsi="Aptos" w:eastAsia="Aptos"/>
+                <w:b w:val="0"/>
+                <w:color w:val="22272B"/>
+                <w:sz w:val="16"/>
+              </w:rPr>
+              <w:t>3,505.78 pulses/degree</w:t>
+            </w:r>
+          </w:p>
+        </w:tc>
+        <w:tc>
+          <w:tcPr>
+            <w:tcW w:type="dxa" w:w="4608"/>
+            <w:shd w:fill="FFFFFF"/>
+            <w:tcMar>
+              <w:top w:w="65" w:type="dxa"/>
+              <w:start w:w="75" w:type="dxa"/>
+              <w:bottom w:w="65" w:type="dxa"/>
+              <w:end w:w="75" w:type="dxa"/>
+            </w:tcMar>
+            <w:vAlign w:val="center"/>
+            <w:tcBorders>
+              <w:top w:val="single" w:sz="3" w:color="AEB8C2"/>
+              <w:bottom w:val="single" w:sz="3" w:color="AEB8C2"/>
+              <w:start w:val="single" w:sz="3" w:color="AEB8C2"/>
+              <w:end w:val="single" w:sz="3" w:color="AEB8C2"/>
+            </w:tcBorders>
+          </w:tcPr>
+          <w:p>
+            <w:pPr>
+              <w:spacing w:after="0" w:line="240" w:lineRule="auto" w:before="0"/>
+            </w:pPr>
+            <w:r>
+              <w:rPr>
+                <w:rFonts w:ascii="Aptos" w:hAnsi="Aptos" w:eastAsia="Aptos"/>
+                <w:b w:val="0"/>
+                <w:color w:val="22272B"/>
+                <w:sz w:val="16"/>
+              </w:rPr>
+              <w:t>Approximately 0.000285 degree per command pulse.</w:t>
+            </w:r>
+          </w:p>
+        </w:tc>
+      </w:tr>
+      <w:tr>
+        <w:tc>
+          <w:tcPr>
+            <w:tcW w:type="dxa" w:w="2448"/>
+            <w:shd w:fill="F3F5F7"/>
+            <w:tcMar>
+              <w:top w:w="65" w:type="dxa"/>
+              <w:start w:w="75" w:type="dxa"/>
+              <w:bottom w:w="65" w:type="dxa"/>
+              <w:end w:w="75" w:type="dxa"/>
+            </w:tcMar>
+            <w:vAlign w:val="center"/>
+            <w:tcBorders>
+              <w:top w:val="single" w:sz="3" w:color="AEB8C2"/>
+              <w:bottom w:val="single" w:sz="3" w:color="AEB8C2"/>
+              <w:start w:val="single" w:sz="3" w:color="AEB8C2"/>
+              <w:end w:val="single" w:sz="3" w:color="AEB8C2"/>
+            </w:tcBorders>
+          </w:tcPr>
+          <w:p>
+            <w:pPr>
+              <w:spacing w:after="0" w:line="240" w:lineRule="auto" w:before="0"/>
+            </w:pPr>
+            <w:r>
+              <w:rPr>
+                <w:rFonts w:ascii="Aptos" w:hAnsi="Aptos" w:eastAsia="Aptos"/>
+                <w:b/>
+                <w:color w:val="22272B"/>
+                <w:sz w:val="16"/>
+              </w:rPr>
+              <w:t>Encoder decoding</w:t>
+            </w:r>
+          </w:p>
+        </w:tc>
+        <w:tc>
+          <w:tcPr>
+            <w:tcW w:type="dxa" w:w="3024"/>
+            <w:shd w:fill="F3F5F7"/>
+            <w:tcMar>
+              <w:top w:w="65" w:type="dxa"/>
+              <w:start w:w="75" w:type="dxa"/>
+              <w:bottom w:w="65" w:type="dxa"/>
+              <w:end w:w="75" w:type="dxa"/>
+            </w:tcMar>
+            <w:vAlign w:val="center"/>
+            <w:tcBorders>
+              <w:top w:val="single" w:sz="3" w:color="AEB8C2"/>
+              <w:bottom w:val="single" w:sz="3" w:color="AEB8C2"/>
+              <w:start w:val="single" w:sz="3" w:color="AEB8C2"/>
+              <w:end w:val="single" w:sz="3" w:color="AEB8C2"/>
+            </w:tcBorders>
+          </w:tcPr>
+          <w:p>
+            <w:pPr>
+              <w:spacing w:after="0" w:line="240" w:lineRule="auto" w:before="0"/>
+            </w:pPr>
+            <w:r>
+              <w:rPr>
+                <w:rFonts w:ascii="Aptos" w:hAnsi="Aptos" w:eastAsia="Aptos"/>
+                <w:b w:val="0"/>
+                <w:color w:val="22272B"/>
+                <w:sz w:val="16"/>
+              </w:rPr>
+              <w:t>5,000 CPR, A-channel CHANGE x2</w:t>
+            </w:r>
+          </w:p>
+        </w:tc>
+        <w:tc>
+          <w:tcPr>
+            <w:tcW w:type="dxa" w:w="4608"/>
+            <w:shd w:fill="F3F5F7"/>
+            <w:tcMar>
+              <w:top w:w="65" w:type="dxa"/>
+              <w:start w:w="75" w:type="dxa"/>
+              <w:bottom w:w="65" w:type="dxa"/>
+              <w:end w:w="75" w:type="dxa"/>
+            </w:tcMar>
+            <w:vAlign w:val="center"/>
+            <w:tcBorders>
+              <w:top w:val="single" w:sz="3" w:color="AEB8C2"/>
+              <w:bottom w:val="single" w:sz="3" w:color="AEB8C2"/>
+              <w:start w:val="single" w:sz="3" w:color="AEB8C2"/>
+              <w:end w:val="single" w:sz="3" w:color="AEB8C2"/>
+            </w:tcBorders>
+          </w:tcPr>
+          <w:p>
+            <w:pPr>
+              <w:spacing w:after="0" w:line="240" w:lineRule="auto" w:before="0"/>
+            </w:pPr>
+            <w:r>
+              <w:rPr>
+                <w:rFonts w:ascii="Aptos" w:hAnsi="Aptos" w:eastAsia="Aptos"/>
+                <w:b w:val="0"/>
+                <w:color w:val="22272B"/>
+                <w:sz w:val="16"/>
+              </w:rPr>
+              <w:t>10,000 motor-shaft counts/rev.</w:t>
+            </w:r>
+          </w:p>
+        </w:tc>
+      </w:tr>
+      <w:tr>
+        <w:tc>
+          <w:tcPr>
+            <w:tcW w:type="dxa" w:w="2448"/>
+            <w:shd w:fill="FFFFFF"/>
+            <w:tcMar>
+              <w:top w:w="65" w:type="dxa"/>
+              <w:start w:w="75" w:type="dxa"/>
+              <w:bottom w:w="65" w:type="dxa"/>
+              <w:end w:w="75" w:type="dxa"/>
+            </w:tcMar>
+            <w:vAlign w:val="center"/>
+            <w:tcBorders>
+              <w:top w:val="single" w:sz="3" w:color="AEB8C2"/>
+              <w:bottom w:val="single" w:sz="3" w:color="AEB8C2"/>
+              <w:start w:val="single" w:sz="3" w:color="AEB8C2"/>
+              <w:end w:val="single" w:sz="3" w:color="AEB8C2"/>
+            </w:tcBorders>
+          </w:tcPr>
+          <w:p>
+            <w:pPr>
+              <w:spacing w:after="0" w:line="240" w:lineRule="auto" w:before="0"/>
+            </w:pPr>
+            <w:r>
+              <w:rPr>
+                <w:rFonts w:ascii="Aptos" w:hAnsi="Aptos" w:eastAsia="Aptos"/>
+                <w:b/>
+                <w:color w:val="22272B"/>
+                <w:sz w:val="16"/>
+              </w:rPr>
+              <w:t>Table encoder scale</w:t>
+            </w:r>
+          </w:p>
+        </w:tc>
+        <w:tc>
+          <w:tcPr>
+            <w:tcW w:type="dxa" w:w="3024"/>
+            <w:shd w:fill="FFFFFF"/>
+            <w:tcMar>
+              <w:top w:w="65" w:type="dxa"/>
+              <w:start w:w="75" w:type="dxa"/>
+              <w:bottom w:w="65" w:type="dxa"/>
+              <w:end w:w="75" w:type="dxa"/>
+            </w:tcMar>
+            <w:vAlign w:val="center"/>
+            <w:tcBorders>
+              <w:top w:val="single" w:sz="3" w:color="AEB8C2"/>
+              <w:bottom w:val="single" w:sz="3" w:color="AEB8C2"/>
+              <w:start w:val="single" w:sz="3" w:color="AEB8C2"/>
+              <w:end w:val="single" w:sz="3" w:color="AEB8C2"/>
+            </w:tcBorders>
+          </w:tcPr>
+          <w:p>
+            <w:pPr>
+              <w:spacing w:after="0" w:line="240" w:lineRule="auto" w:before="0"/>
+            </w:pPr>
+            <w:r>
+              <w:rPr>
+                <w:rFonts w:ascii="Aptos" w:hAnsi="Aptos" w:eastAsia="Aptos"/>
+                <w:b w:val="0"/>
+                <w:color w:val="22272B"/>
+                <w:sz w:val="16"/>
+              </w:rPr>
+              <w:t>246,500 counts/rev</w:t>
+            </w:r>
+          </w:p>
+        </w:tc>
+        <w:tc>
+          <w:tcPr>
+            <w:tcW w:type="dxa" w:w="4608"/>
+            <w:shd w:fill="FFFFFF"/>
+            <w:tcMar>
+              <w:top w:w="65" w:type="dxa"/>
+              <w:start w:w="75" w:type="dxa"/>
+              <w:bottom w:w="65" w:type="dxa"/>
+              <w:end w:w="75" w:type="dxa"/>
+            </w:tcMar>
+            <w:vAlign w:val="center"/>
+            <w:tcBorders>
+              <w:top w:val="single" w:sz="3" w:color="AEB8C2"/>
+              <w:bottom w:val="single" w:sz="3" w:color="AEB8C2"/>
+              <w:start w:val="single" w:sz="3" w:color="AEB8C2"/>
+              <w:end w:val="single" w:sz="3" w:color="AEB8C2"/>
+            </w:tcBorders>
+          </w:tcPr>
+          <w:p>
+            <w:pPr>
+              <w:spacing w:after="0" w:line="240" w:lineRule="auto" w:before="0"/>
+            </w:pPr>
+            <w:r>
+              <w:rPr>
+                <w:rFonts w:ascii="Aptos" w:hAnsi="Aptos" w:eastAsia="Aptos"/>
+                <w:b w:val="0"/>
+                <w:color w:val="22272B"/>
+                <w:sz w:val="16"/>
+              </w:rPr>
+              <w:t>684.72 counts/degree, approximately 0.001460 degree/count.</w:t>
+            </w:r>
+          </w:p>
+        </w:tc>
+      </w:tr>
+      <w:tr>
+        <w:tc>
+          <w:tcPr>
+            <w:tcW w:type="dxa" w:w="2448"/>
+            <w:shd w:fill="F3F5F7"/>
+            <w:tcMar>
+              <w:top w:w="65" w:type="dxa"/>
+              <w:start w:w="75" w:type="dxa"/>
+              <w:bottom w:w="65" w:type="dxa"/>
+              <w:end w:w="75" w:type="dxa"/>
+            </w:tcMar>
+            <w:vAlign w:val="center"/>
+            <w:tcBorders>
+              <w:top w:val="single" w:sz="3" w:color="AEB8C2"/>
+              <w:bottom w:val="single" w:sz="3" w:color="AEB8C2"/>
+              <w:start w:val="single" w:sz="3" w:color="AEB8C2"/>
+              <w:end w:val="single" w:sz="3" w:color="AEB8C2"/>
+            </w:tcBorders>
+          </w:tcPr>
+          <w:p>
+            <w:pPr>
+              <w:spacing w:after="0" w:line="240" w:lineRule="auto" w:before="0"/>
+            </w:pPr>
+            <w:r>
+              <w:rPr>
+                <w:rFonts w:ascii="Aptos" w:hAnsi="Aptos" w:eastAsia="Aptos"/>
+                <w:b/>
+                <w:color w:val="22272B"/>
+                <w:sz w:val="16"/>
+              </w:rPr>
+              <w:t>Correction gain</w:t>
+            </w:r>
+          </w:p>
+        </w:tc>
+        <w:tc>
+          <w:tcPr>
+            <w:tcW w:type="dxa" w:w="3024"/>
+            <w:shd w:fill="F3F5F7"/>
+            <w:tcMar>
+              <w:top w:w="65" w:type="dxa"/>
+              <w:start w:w="75" w:type="dxa"/>
+              <w:bottom w:w="65" w:type="dxa"/>
+              <w:end w:w="75" w:type="dxa"/>
+            </w:tcMar>
+            <w:vAlign w:val="center"/>
+            <w:tcBorders>
+              <w:top w:val="single" w:sz="3" w:color="AEB8C2"/>
+              <w:bottom w:val="single" w:sz="3" w:color="AEB8C2"/>
+              <w:start w:val="single" w:sz="3" w:color="AEB8C2"/>
+              <w:end w:val="single" w:sz="3" w:color="AEB8C2"/>
+            </w:tcBorders>
+          </w:tcPr>
+          <w:p>
+            <w:pPr>
+              <w:spacing w:after="0" w:line="240" w:lineRule="auto" w:before="0"/>
+            </w:pPr>
+            <w:r>
+              <w:rPr>
+                <w:rFonts w:ascii="Aptos" w:hAnsi="Aptos" w:eastAsia="Aptos"/>
+                <w:b w:val="0"/>
+                <w:color w:val="22272B"/>
+                <w:sz w:val="16"/>
+              </w:rPr>
+              <w:t>20 pulse-Hz/degree</w:t>
+            </w:r>
+          </w:p>
+        </w:tc>
+        <w:tc>
+          <w:tcPr>
+            <w:tcW w:type="dxa" w:w="4608"/>
+            <w:shd w:fill="F3F5F7"/>
+            <w:tcMar>
+              <w:top w:w="65" w:type="dxa"/>
+              <w:start w:w="75" w:type="dxa"/>
+              <w:bottom w:w="65" w:type="dxa"/>
+              <w:end w:w="75" w:type="dxa"/>
+            </w:tcMar>
+            <w:vAlign w:val="center"/>
+            <w:tcBorders>
+              <w:top w:val="single" w:sz="3" w:color="AEB8C2"/>
+              <w:bottom w:val="single" w:sz="3" w:color="AEB8C2"/>
+              <w:start w:val="single" w:sz="3" w:color="AEB8C2"/>
+              <w:end w:val="single" w:sz="3" w:color="AEB8C2"/>
+            </w:tcBorders>
+          </w:tcPr>
+          <w:p>
+            <w:pPr>
+              <w:spacing w:after="0" w:line="240" w:lineRule="auto" w:before="0"/>
+            </w:pPr>
+            <w:r>
+              <w:rPr>
+                <w:rFonts w:ascii="Aptos" w:hAnsi="Aptos" w:eastAsia="Aptos"/>
+                <w:b w:val="0"/>
+                <w:color w:val="22272B"/>
+                <w:sz w:val="16"/>
+              </w:rPr>
+              <w:t>Closed-loop correction term applied to feedforward command.</w:t>
+            </w:r>
+          </w:p>
+        </w:tc>
+      </w:tr>
+      <w:tr>
+        <w:tc>
+          <w:tcPr>
+            <w:tcW w:type="dxa" w:w="2448"/>
+            <w:shd w:fill="FFFFFF"/>
+            <w:tcMar>
+              <w:top w:w="65" w:type="dxa"/>
+              <w:start w:w="75" w:type="dxa"/>
+              <w:bottom w:w="65" w:type="dxa"/>
+              <w:end w:w="75" w:type="dxa"/>
+            </w:tcMar>
+            <w:vAlign w:val="center"/>
+            <w:tcBorders>
+              <w:top w:val="single" w:sz="3" w:color="AEB8C2"/>
+              <w:bottom w:val="single" w:sz="3" w:color="AEB8C2"/>
+              <w:start w:val="single" w:sz="3" w:color="AEB8C2"/>
+              <w:end w:val="single" w:sz="3" w:color="AEB8C2"/>
+            </w:tcBorders>
+          </w:tcPr>
+          <w:p>
+            <w:pPr>
+              <w:spacing w:after="0" w:line="240" w:lineRule="auto" w:before="0"/>
+            </w:pPr>
+            <w:r>
+              <w:rPr>
+                <w:rFonts w:ascii="Aptos" w:hAnsi="Aptos" w:eastAsia="Aptos"/>
+                <w:b/>
+                <w:color w:val="22272B"/>
+                <w:sz w:val="16"/>
+              </w:rPr>
+              <w:t>Correction limits</w:t>
+            </w:r>
+          </w:p>
+        </w:tc>
+        <w:tc>
+          <w:tcPr>
+            <w:tcW w:type="dxa" w:w="3024"/>
+            <w:shd w:fill="FFFFFF"/>
+            <w:tcMar>
+              <w:top w:w="65" w:type="dxa"/>
+              <w:start w:w="75" w:type="dxa"/>
+              <w:bottom w:w="65" w:type="dxa"/>
+              <w:end w:w="75" w:type="dxa"/>
+            </w:tcMar>
+            <w:vAlign w:val="center"/>
+            <w:tcBorders>
+              <w:top w:val="single" w:sz="3" w:color="AEB8C2"/>
+              <w:bottom w:val="single" w:sz="3" w:color="AEB8C2"/>
+              <w:start w:val="single" w:sz="3" w:color="AEB8C2"/>
+              <w:end w:val="single" w:sz="3" w:color="AEB8C2"/>
+            </w:tcBorders>
+          </w:tcPr>
+          <w:p>
+            <w:pPr>
+              <w:spacing w:after="0" w:line="240" w:lineRule="auto" w:before="0"/>
+            </w:pPr>
+            <w:r>
+              <w:rPr>
+                <w:rFonts w:ascii="Aptos" w:hAnsi="Aptos" w:eastAsia="Aptos"/>
+                <w:b w:val="0"/>
+                <w:color w:val="22272B"/>
+                <w:sz w:val="16"/>
+              </w:rPr>
+              <w:t>250 Hz absolute and 5% of feedforward relative</w:t>
+            </w:r>
+          </w:p>
+        </w:tc>
+        <w:tc>
+          <w:tcPr>
+            <w:tcW w:type="dxa" w:w="4608"/>
+            <w:shd w:fill="FFFFFF"/>
+            <w:tcMar>
+              <w:top w:w="65" w:type="dxa"/>
+              <w:start w:w="75" w:type="dxa"/>
+              <w:bottom w:w="65" w:type="dxa"/>
+              <w:end w:w="75" w:type="dxa"/>
+            </w:tcMar>
+            <w:vAlign w:val="center"/>
+            <w:tcBorders>
+              <w:top w:val="single" w:sz="3" w:color="AEB8C2"/>
+              <w:bottom w:val="single" w:sz="3" w:color="AEB8C2"/>
+              <w:start w:val="single" w:sz="3" w:color="AEB8C2"/>
+              <w:end w:val="single" w:sz="3" w:color="AEB8C2"/>
+            </w:tcBorders>
+          </w:tcPr>
+          <w:p>
+            <w:pPr>
+              <w:spacing w:after="0" w:line="240" w:lineRule="auto" w:before="0"/>
+            </w:pPr>
+            <w:r>
+              <w:rPr>
+                <w:rFonts w:ascii="Aptos" w:hAnsi="Aptos" w:eastAsia="Aptos"/>
+                <w:b w:val="0"/>
+                <w:color w:val="22272B"/>
+                <w:sz w:val="16"/>
+              </w:rPr>
+              <w:t>Prevents the correction term from dominating commanded motion.</w:t>
+            </w:r>
+          </w:p>
+        </w:tc>
+      </w:tr>
+    </w:tbl>
+    <w:p>
+      <w:pPr>
+        <w:spacing w:before="0" w:after="100" w:line="259" w:lineRule="auto"/>
+      </w:pPr>
+      <w:r>
+        <w:t>8.4 Measured Operating Results</w:t>
+      </w:r>
+    </w:p>
+    <w:tbl>
+      <w:tblPr>
+        <w:tblW w:type="auto" w:w="0"/>
+        <w:jc w:val="center"/>
+        <w:tblLayout w:type="autofit"/>
+        <w:tblLook w:firstColumn="1" w:firstRow="1" w:lastColumn="0" w:lastRow="0" w:noHBand="0" w:noVBand="1" w:val="04A0"/>
+      </w:tblPr>
+      <w:tblGrid>
+        <w:gridCol w:w="3456"/>
+        <w:gridCol w:w="3456"/>
+        <w:gridCol w:w="3456"/>
+      </w:tblGrid>
+      <w:tr>
+        <w:trPr>
+          <w:tblHeader/>
+          <w:tblHeader w:val="true"/>
+        </w:trPr>
+        <w:tc>
+          <w:tcPr>
             <w:tcW w:type="dxa" w:w="2304"/>
             <w:shd w:fill="20364F"/>
             <w:tcMar>
@@ -10091,13 +10286,7 @@
         <w:spacing w:before="0" w:after="100" w:line="259" w:lineRule="auto"/>
       </w:pPr>
       <w:r>
-        <w:rPr>
-          <w:rFonts w:ascii="Aptos" w:hAnsi="Aptos" w:eastAsia="Aptos"/>
-          <w:b/>
-          <w:color w:val="22272B"/>
-          <w:sz w:val="19"/>
-        </w:rPr>
-        <w:t>8.4 Host Workflow and Data Products</w:t>
+        <w:t>8.5 Host Workflow and Data Products</w:t>
       </w:r>
     </w:p>
     <w:p>
@@ -11135,7 +11324,7 @@
                 <w:color w:val="22272B"/>
                 <w:sz w:val="16"/>
               </w:rPr>
-              <w:t>Demonstrated with ring-capacity correction action</w:t>
+              <w:t>Verified by public compile-time layout contract and 4,095-record definition</w:t>
             </w:r>
           </w:p>
         </w:tc>
@@ -11890,7 +12079,7 @@
         <w:pStyle w:val="ListBullet"/>
       </w:pPr>
       <w:r>
-        <w:t>The shared-ring capacity correction is implemented or the reserved region is enlarged before controlled release.</w:t>
+        <w:t>The shared-ring capacity is fixed at 4,095 records and compile-time assertions verify record size, metadata offset, and total reserved-region fit.</w:t>
       </w:r>
     </w:p>
     <w:p>
@@ -12117,7 +12306,7 @@
           </w:tcPr>
           <w:p>
             <w:r>
-              <w:t>The reviewed v0.1 sample producer runs at 100 Hz and 6.4 kB/s. This validates the transport path but does not represent the reason for the dual-core split; the design driver is higher STEP-frequency headroom and pulse regularity at 256 microsteps.</w:t>
+              <w:t>The reviewed 100 Hz, 6.4 kB/s sample validates the inter-core transport path but is not the performance reason for the dual-core split. The public layout contract now uses a 4,095-record ring, protocol version 1U in the uint16_t wire field, and a documented uint32 timestamp-wrap test.</w:t>
             </w:r>
           </w:p>
         </w:tc>
@@ -12517,7 +12706,7 @@
           </w:tcPr>
           <w:p>
             <w:r>
-              <w:t>5.2</w:t>
+              <w:t>5.3</w:t>
             </w:r>
           </w:p>
         </w:tc>
@@ -12527,7 +12716,7 @@
           </w:tcPr>
           <w:p>
             <w:r>
-              <w:t>2026-08-05</w:t>
+              <w:t>2026-08-06</w:t>
             </w:r>
           </w:p>
         </w:tc>
@@ -12537,7 +12726,7 @@
           </w:tcPr>
           <w:p>
             <w:r>
-              <w:t>Corrected the dual-core trade-off rationale: the architecture was selected to preserve smooth higher-speed motion at the 256-microstep setting by isolating pulse-critical control from variable-latency communication and telemetry work. Clarified that 100 Hz, 6.4 kB/s telemetry is not the performance justification.</w:t>
+              <w:t>Corrected the public MotionIPC boundary and protocol contracts: ring capacity reduced to 4,095 records, compile-time size guards added, protocol version representation aligned with the uint16_t field, and uint32 microsecond timestamp-wrap handling documented and tested. Retained the higher-STEP-frequency rationale for the dual-core split.</w:t>
             </w:r>
           </w:p>
         </w:tc>
@@ -15940,7 +16129,7 @@
         <w:color w:val="5B6670"/>
         <w:sz w:val="15"/>
       </w:rPr>
-      <w:t>HERDER ELEKTRONISCHE SYSTEMEN   |   ENGINEERING REQUIREMENTS   |   REV 5.2</w:t>
+      <w:t>HERDER ELEKTRONISCHE SYSTEMEN   |   ENGINEERING REQUIREMENTS   |   REV 5.3</w:t>
     </w:r>
   </w:p>
 </w:hdr>

</xml_diff>